<commit_message>
Actualizar procedimiento de uso a la version 1.1 (Capitulo 4)
Refleja el comportamiento nuevo del sistema: stock minimo calculado
automaticamente (factor de seguridad por clase ABC, redondeo al
tamano del set), clasificacion ABC por percentil de ranking con pesos
AHP, alerta de ventana de compra SDT-USACH, y los campos nuevos
(operacion, ubicacion, RAM asociado). Tambien corrige dos defectos del
documento: los emojis de color no renderizaban en Word/PDF (se
reemplazan por texto) y la numeracion de pasos no reiniciaba entre
subsecciones.
</commit_message>
<xml_diff>
--- a/Procedimiento_Uso_App_Control_Insumos_SIMET-USACH.docx
+++ b/Procedimiento_Uso_App_Control_Insumos_SIMET-USACH.docx
@@ -92,7 +92,7 @@
           </w:tcPr>
           <w:p>
             <w:r>
-              <w:t>1.0</w:t>
+              <w:t>1.1</w:t>
             </w:r>
           </w:p>
         </w:tc>
@@ -119,7 +119,7 @@
           </w:tcPr>
           <w:p>
             <w:r>
-              <w:t>22-08-2026</w:t>
+              <w:t>31-08-2026</w:t>
             </w:r>
           </w:p>
         </w:tc>
@@ -194,7 +194,10 @@
     </w:p>
     <w:p>
       <w:r>
-        <w:t>Establecer la forma correcta de utilizar el Sistema de Control de Insumos Críticos (en adelante, "la aplicación" o "el sistema") para registrar ingresos y egresos de insumos, consultar el estado de stock y mantener actualizado el catálogo de insumos críticos del laboratorio SIMET-USACH, asegurando trazabilidad y disponibilidad de la información para la toma de decisiones.</w:t>
+        <w:rPr>
+          <w:b w:val="0"/>
+        </w:rPr>
+        <w:t>Establecer la forma correcta de utilizar el Sistema de Control de Insumos Críticos (en adelante, "la aplicación" o "el sistema") para registrar ingresos y egresos de insumos, consultar su clasificación ABC, stock y alertas, y mantener actualizado el catálogo de insumos críticos del laboratorio SIMET-USACH, asegurando trazabilidad y disponibilidad de la información para la toma de decisiones.</w:t>
       </w:r>
     </w:p>
     <w:p>
@@ -207,7 +210,10 @@
     </w:p>
     <w:p>
       <w:r>
-        <w:t>Este procedimiento aplica a todo el personal del laboratorio SIMET-USACH que registre movimientos de insumos (ingresos o egresos), consulte el estado de stock, o administre el catálogo de insumos críticos, ya sea utilizando la aplicación en su versión local (instalada en el computador del laboratorio) o en su versión publicada en Streamlit Community Cloud.</w:t>
+        <w:rPr>
+          <w:b w:val="0"/>
+        </w:rPr>
+        <w:t>Este procedimiento aplica a todo el personal del laboratorio SIMET-USACH que registre movimientos de insumos (ingresos o egresos), consulte el estado de stock y sus alertas, o administre el catálogo de insumos críticos, ya sea utilizando la aplicación en su versión local (instalada en el computador del laboratorio) o en su versión publicada en Streamlit Community Cloud.</w:t>
       </w:r>
     </w:p>
     <w:p>
@@ -229,7 +235,10 @@
         <w:t xml:space="preserve">Planilla </w:t>
       </w:r>
       <w:r>
-        <w:t>Clasificación ABC Multicriterio de insumos críticos SIMET-USACH.</w:t>
+        <w:rPr>
+          <w:b w:val="0"/>
+        </w:rPr>
+        <w:t>Control_Insumos_Consolidado_SIMET-USACH.xlsx — catálogo, clasificación ABC, stock mínimo y alertas de referencia usados como carga inicial de la aplicación.</w:t>
       </w:r>
     </w:p>
     <w:p>
@@ -238,12 +247,9 @@
       </w:pPr>
       <w:r>
         <w:rPr>
-          <w:b/>
+          <w:b w:val="0"/>
         </w:rPr>
-        <w:t xml:space="preserve">Planilla </w:t>
-      </w:r>
-      <w:r>
-        <w:t>Ficha de Consumo de Insumos por Operación SIMET-USACH.</w:t>
+        <w:t>Capítulo 4 de la tesis — metodología de clasificación ABC multicriterio (AHP), fórmula de stock mínimo y definición de alertas.</w:t>
       </w:r>
     </w:p>
     <w:p>
@@ -251,6 +257,9 @@
         <w:pStyle w:val="ListBullet"/>
       </w:pPr>
       <w:r>
+        <w:rPr>
+          <w:b w:val="0"/>
+        </w:rPr>
         <w:t>Repositorio del código fuente de la aplicación: github.com/scaceresmanzano-boop/control-insumos-simet.</w:t>
       </w:r>
     </w:p>
@@ -327,6 +336,9 @@
           </w:tcPr>
           <w:p>
             <w:r>
+              <w:rPr>
+                <w:b w:val="0"/>
+              </w:rPr>
               <w:t>Material o consumible cuya falta de disponibilidad puede afectar la continuidad de los ensayos u operaciones del laboratorio.</w:t>
             </w:r>
           </w:p>
@@ -352,7 +364,38 @@
           </w:tcPr>
           <w:p>
             <w:r>
-              <w:t>Metodología multicriterio (Hadi-Vencheh) que ordena los insumos en clases A, B o C según un puntaje ponderado de costo unitario, frecuencia de uso, impacto operacional y tiempo de reposición. Clase A agrupa a los insumos más críticos.</w:t>
+              <w:rPr>
+                <w:b w:val="0"/>
+              </w:rPr>
+              <w:t>Metodología multicriterio con pesos AHP (costo unitario 4,11%, frecuencia de uso 31,29%, impacto operacional 56,91%, tiempo de reposición 7,69%) que ordena los insumos por puntaje ponderado y los clasifica por percentil de posición en el ranking: el 20% superior es Clase A, el siguiente 30% es Clase B, y el 50% restante es Clase C.</w:t>
+            </w:r>
+          </w:p>
+        </w:tc>
+      </w:tr>
+      <w:tr>
+        <w:tc>
+          <w:tcPr>
+            <w:tcW w:type="dxa" w:w="2551"/>
+          </w:tcPr>
+          <w:p>
+            <w:r>
+              <w:rPr>
+                <w:b/>
+              </w:rPr>
+              <w:t>Factor de seguridad</w:t>
+            </w:r>
+          </w:p>
+        </w:tc>
+        <w:tc>
+          <w:tcPr>
+            <w:tcW w:type="dxa" w:w="6520"/>
+          </w:tcPr>
+          <w:p>
+            <w:r>
+              <w:rPr>
+                <w:b w:val="0"/>
+              </w:rPr>
+              <w:t>Porcentaje adicional que se suma al cálculo del stock mínimo según la clase ABC del insumo: 50% para Clase A, 30% para Clase B y 15% para Clase C.</w:t>
             </w:r>
           </w:p>
         </w:tc>
@@ -377,7 +420,38 @@
           </w:tcPr>
           <w:p>
             <w:r>
-              <w:t>Cantidad de un insumo bajo la cual se considera que el nivel de existencias es insuficiente y se activa la alerta correspondiente.</w:t>
+              <w:rPr>
+                <w:b w:val="0"/>
+              </w:rPr>
+              <w:t>Cantidad de un insumo bajo la cual se activa la alerta de reposición. Se calcula automáticamente — no se edita a mano — a partir del consumo promedio diario, el tiempo de reposición y el factor de seguridad, redondeado hacia arriba al múltiplo exacto del tamaño del set de reposición (unidades por cambio).</w:t>
+            </w:r>
+          </w:p>
+        </w:tc>
+      </w:tr>
+      <w:tr>
+        <w:tc>
+          <w:tcPr>
+            <w:tcW w:type="dxa" w:w="2551"/>
+          </w:tcPr>
+          <w:p>
+            <w:r>
+              <w:rPr>
+                <w:b/>
+              </w:rPr>
+              <w:t>Ventana SDT-USACH</w:t>
+            </w:r>
+          </w:p>
+        </w:tc>
+        <w:tc>
+          <w:tcPr>
+            <w:tcW w:type="dxa" w:w="6520"/>
+          </w:tcPr>
+          <w:p>
+            <w:r>
+              <w:rPr>
+                <w:b w:val="0"/>
+              </w:rPr>
+              <w:t>Ventana de facturación del día 1 al día 20 de cada mes. Si la fecha proyectada de agotamiento de un insumo (al ritmo de consumo actual) cae después del día 20, se activa la alerta de ventana de compra.</w:t>
             </w:r>
           </w:p>
         </w:tc>
@@ -402,6 +476,9 @@
           </w:tcPr>
           <w:p>
             <w:r>
+              <w:rPr>
+                <w:b w:val="0"/>
+              </w:rPr>
               <w:t>Movimiento que aumenta el stock de un insumo (por ejemplo, una compra recibida).</w:t>
             </w:r>
           </w:p>
@@ -427,6 +504,9 @@
           </w:tcPr>
           <w:p>
             <w:r>
+              <w:rPr>
+                <w:b w:val="0"/>
+              </w:rPr>
               <w:t>Movimiento que disminuye el stock de un insumo (por ejemplo, su consumo en un ensayo u orden de trabajo).</w:t>
             </w:r>
           </w:p>
@@ -452,7 +532,38 @@
           </w:tcPr>
           <w:p>
             <w:r>
+              <w:rPr>
+                <w:b w:val="0"/>
+              </w:rPr>
               <w:t>Orden de trabajo u ensayo asociado a un egreso de insumo.</w:t>
+            </w:r>
+          </w:p>
+        </w:tc>
+      </w:tr>
+      <w:tr>
+        <w:tc>
+          <w:tcPr>
+            <w:tcW w:type="dxa" w:w="2551"/>
+          </w:tcPr>
+          <w:p>
+            <w:r>
+              <w:rPr>
+                <w:b/>
+              </w:rPr>
+              <w:t>RAM</w:t>
+            </w:r>
+          </w:p>
+        </w:tc>
+        <w:tc>
+          <w:tcPr>
+            <w:tcW w:type="dxa" w:w="6520"/>
+          </w:tcPr>
+          <w:p>
+            <w:r>
+              <w:rPr>
+                <w:b w:val="0"/>
+              </w:rPr>
+              <w:t>Resolución de Aprobación de Muestra. Su folio se puede dejar registrado como referencia en el campo "RAM asociado" de cada egreso, ya que el sistema no se integra directamente con el ERP del laboratorio.</w:t>
             </w:r>
           </w:p>
         </w:tc>
@@ -477,6 +588,9 @@
           </w:tcPr>
           <w:p>
             <w:r>
+              <w:rPr>
+                <w:b w:val="0"/>
+              </w:rPr>
               <w:t>Usuario autorizado (SCM) para incorporar insumos nuevos al catálogo mediante contraseña.</w:t>
             </w:r>
           </w:p>
@@ -556,7 +670,10 @@
           </w:tcPr>
           <w:p>
             <w:r>
-              <w:t>Registrar ingresos y egresos de insumos de forma oportuna y veraz, indicando responsable y ensayo/OT en cada egreso. Consultar el estado de stock antes de iniciar un ensayo que requiera insumos críticos.</w:t>
+              <w:rPr>
+                <w:b w:val="0"/>
+              </w:rPr>
+              <w:t>Registrar ingresos y egresos de insumos de forma oportuna y veraz, indicando responsable, ensayo/OT y RAM asociado (si corresponde) en cada egreso. Consultar el estado de stock y sus alertas antes de iniciar un ensayo que requiera insumos críticos.</w:t>
             </w:r>
           </w:p>
         </w:tc>
@@ -581,7 +698,10 @@
           </w:tcPr>
           <w:p>
             <w:r>
-              <w:t>Mantener actualizado el catálogo de insumos, incorporando ítems nuevos cuando corresponda, definiendo stock mínimo, proveedor y criterios de clasificación ABC. Custodiar la contraseña de administrador.</w:t>
+              <w:rPr>
+                <w:b w:val="0"/>
+              </w:rPr>
+              <w:t>Mantener actualizado el catálogo de insumos, incorporando ítems nuevos cuando corresponda, y completando ubicación física, proveedor y los criterios necesarios para que el stock mínimo y la clasificación ABC se calculen correctamente. Custodiar la contraseña de administrador.</w:t>
             </w:r>
           </w:p>
         </w:tc>
@@ -610,6 +730,9 @@
     </w:p>
     <w:p>
       <w:r>
+        <w:rPr>
+          <w:b w:val="0"/>
+        </w:rPr>
         <w:t>El sistema puede utilizarse de dos formas:</w:t>
       </w:r>
     </w:p>
@@ -624,6 +747,9 @@
         <w:t xml:space="preserve">Acceso local: </w:t>
       </w:r>
       <w:r>
+        <w:rPr>
+          <w:b w:val="0"/>
+        </w:rPr>
         <w:t>Doble clic en el acceso directo "Control Insumos SIMET" del Escritorio (o en el archivo Abrir_App.bat dentro de la carpeta del proyecto). Se abre una ventana del sistema y, luego, la aplicación en el navegador. No cerrar esa ventana mientras se use la aplicación.</w:t>
       </w:r>
     </w:p>
@@ -638,11 +764,17 @@
         <w:t xml:space="preserve">Acceso remoto: </w:t>
       </w:r>
       <w:r>
+        <w:rPr>
+          <w:b w:val="0"/>
+        </w:rPr>
         <w:t>Ingresar directamente al link público entregado por el laboratorio (Streamlit Community Cloud). No requiere instalación, pero el almacenamiento de esa versión puede reiniciarse si el servicio está inactivo por un tiempo prolongado; para el registro diario de movimientos se recomienda el acceso local.</w:t>
       </w:r>
     </w:p>
     <w:p>
       <w:r>
+        <w:rPr>
+          <w:b w:val="0"/>
+        </w:rPr>
         <w:t>Una vez abierta, la aplicación muestra tres pantallas disponibles en el menú lateral izquierdo: Registrar Ingreso, Registrar Egreso y Ver Estado.</w:t>
       </w:r>
     </w:p>
@@ -656,63 +788,87 @@
     </w:p>
     <w:p>
       <w:r>
+        <w:rPr>
+          <w:b w:val="0"/>
+        </w:rPr>
         <w:t>Se utiliza cada vez que se recibe una compra o reposición de un insumo. Pasos:</w:t>
       </w:r>
     </w:p>
     <w:p>
       <w:pPr>
-        <w:pStyle w:val="ListNumber"/>
+        <w:ind w:left="357" w:hanging="357"/>
       </w:pPr>
       <w:r>
-        <w:t>En el menú lateral, seleccionar "Registrar Ingreso".</w:t>
+        <w:rPr>
+          <w:b w:val="0"/>
+        </w:rPr>
+        <w:t>1. En el menú lateral, seleccionar "Registrar Ingreso".</w:t>
       </w:r>
     </w:p>
     <w:p>
       <w:pPr>
-        <w:pStyle w:val="ListNumber"/>
+        <w:ind w:left="357" w:hanging="357"/>
       </w:pPr>
       <w:r>
-        <w:t>Opcional: escanear el código de barras del insumo con el lector USB en el campo "Escanear código de barras"; el sistema selecciona automáticamente el insumo correspondiente. Si no se escanea, seleccionar el insumo manualmente en el campo "Insumo".</w:t>
+        <w:rPr>
+          <w:b w:val="0"/>
+        </w:rPr>
+        <w:t>2. Opcional: escanear el código de barras del insumo con el lector USB en el campo "Escanear código de barras"; el sistema selecciona automáticamente el insumo correspondiente. Si no se escanea, seleccionar el insumo manualmente en el campo "Insumo".</w:t>
       </w:r>
     </w:p>
     <w:p>
       <w:pPr>
-        <w:pStyle w:val="ListNumber"/>
+        <w:ind w:left="357" w:hanging="357"/>
       </w:pPr>
       <w:r>
-        <w:t>Ingresar la "Cantidad" recibida.</w:t>
+        <w:rPr>
+          <w:b w:val="0"/>
+        </w:rPr>
+        <w:t>3. Ingresar la "Cantidad" recibida.</w:t>
       </w:r>
     </w:p>
     <w:p>
       <w:pPr>
-        <w:pStyle w:val="ListNumber"/>
+        <w:ind w:left="357" w:hanging="357"/>
       </w:pPr>
       <w:r>
-        <w:t>Ingresar el "Proveedor".</w:t>
+        <w:rPr>
+          <w:b w:val="0"/>
+        </w:rPr>
+        <w:t>4. Ingresar el "Proveedor".</w:t>
       </w:r>
     </w:p>
     <w:p>
       <w:pPr>
-        <w:pStyle w:val="ListNumber"/>
+        <w:ind w:left="357" w:hanging="357"/>
       </w:pPr>
       <w:r>
-        <w:t>Verificar o ajustar la "Fecha" (por defecto, la fecha actual).</w:t>
+        <w:rPr>
+          <w:b w:val="0"/>
+        </w:rPr>
+        <w:t>5. Verificar o ajustar la "Fecha" (por defecto, la fecha actual).</w:t>
       </w:r>
     </w:p>
     <w:p>
       <w:pPr>
-        <w:pStyle w:val="ListNumber"/>
+        <w:ind w:left="357" w:hanging="357"/>
       </w:pPr>
       <w:r>
-        <w:t>Opcional: agregar una observación.</w:t>
+        <w:rPr>
+          <w:b w:val="0"/>
+        </w:rPr>
+        <w:t>6. Opcional: agregar una observación.</w:t>
       </w:r>
     </w:p>
     <w:p>
       <w:pPr>
-        <w:pStyle w:val="ListNumber"/>
+        <w:ind w:left="357" w:hanging="357"/>
       </w:pPr>
       <w:r>
-        <w:t>Presionar "Registrar ingreso". El sistema suma la cantidad al stock actual del insumo y deja el movimiento registrado en la tabla "Últimos ingresos registrados".</w:t>
+        <w:rPr>
+          <w:b w:val="0"/>
+        </w:rPr>
+        <w:t>7. Presionar "Registrar ingreso". El sistema suma la cantidad al stock actual del insumo y deja el movimiento registrado en la tabla "Últimos ingresos registrados".</w:t>
       </w:r>
     </w:p>
     <w:p>
@@ -725,79 +881,120 @@
     </w:p>
     <w:p>
       <w:r>
+        <w:rPr>
+          <w:b w:val="0"/>
+        </w:rPr>
         <w:t>Se utiliza cada vez que se retira un insumo del laboratorio para un ensayo u orden de trabajo. Pasos:</w:t>
       </w:r>
     </w:p>
     <w:p>
       <w:pPr>
-        <w:pStyle w:val="ListNumber"/>
+        <w:ind w:left="357" w:hanging="357"/>
       </w:pPr>
       <w:r>
-        <w:t>En el menú lateral, seleccionar "Registrar Egreso".</w:t>
+        <w:rPr>
+          <w:b w:val="0"/>
+        </w:rPr>
+        <w:t>1. En el menú lateral, seleccionar "Registrar Egreso".</w:t>
       </w:r>
     </w:p>
     <w:p>
       <w:pPr>
-        <w:pStyle w:val="ListNumber"/>
+        <w:ind w:left="357" w:hanging="357"/>
       </w:pPr>
       <w:r>
-        <w:t>Opcional: escanear el código de barras del insumo, o seleccionarlo manualmente en el campo "Insumo".</w:t>
+        <w:rPr>
+          <w:b w:val="0"/>
+        </w:rPr>
+        <w:t>2. Opcional: escanear el código de barras del insumo, o seleccionarlo manualmente en el campo "Insumo".</w:t>
       </w:r>
     </w:p>
     <w:p>
       <w:pPr>
-        <w:pStyle w:val="ListNumber"/>
+        <w:ind w:left="357" w:hanging="357"/>
       </w:pPr>
       <w:r>
-        <w:t>El sistema muestra, bajo el selector de insumo, quién fue la última persona que retiró ese insumo, cuándo y para qué ensayo/OT, como referencia.</w:t>
+        <w:rPr>
+          <w:b w:val="0"/>
+        </w:rPr>
+        <w:t>3. El sistema muestra, bajo el selector de insumo, quién fue la última persona que retiró ese insumo, cuándo y para qué ensayo/OT, como referencia.</w:t>
       </w:r>
     </w:p>
     <w:p>
       <w:pPr>
-        <w:pStyle w:val="ListNumber"/>
+        <w:ind w:left="357" w:hanging="357"/>
       </w:pPr>
       <w:r>
-        <w:t>Ingresar la "Cantidad" a retirar. El sistema valida que exista stock suficiente; si la cantidad solicitada supera el stock disponible, la operación se bloquea y muestra un mensaje de error.</w:t>
+        <w:rPr>
+          <w:b w:val="0"/>
+        </w:rPr>
+        <w:t>4. Ingresar la "Cantidad" a retirar. El sistema valida que exista stock suficiente; si la cantidad solicitada supera el stock disponible, la operación se bloquea y muestra un mensaje de error.</w:t>
       </w:r>
     </w:p>
     <w:p>
       <w:pPr>
-        <w:pStyle w:val="ListNumber"/>
+        <w:ind w:left="357" w:hanging="357"/>
       </w:pPr>
       <w:r>
-        <w:t>Ingresar el "Ensayo / OT asociado".</w:t>
+        <w:rPr>
+          <w:b w:val="0"/>
+        </w:rPr>
+        <w:t>5. Ingresar el "Ensayo / OT asociado".</w:t>
       </w:r>
     </w:p>
     <w:p>
       <w:pPr>
-        <w:pStyle w:val="ListNumber"/>
+        <w:ind w:left="357" w:hanging="357"/>
       </w:pPr>
       <w:r>
-        <w:t>Seleccionar el "Responsable" de la lista predefinida. Si la persona no aparece en la lista, seleccionar "➕ Otro (nuevo)" y escribir su nombre o iniciales en el campo que aparece debajo; quedará disponible en la lista para la próxima vez.</w:t>
+        <w:rPr>
+          <w:b w:val="0"/>
+        </w:rPr>
+        <w:t>6. Seleccionar el "Responsable" de la lista predefinida. Si la persona no aparece en la lista, seleccionar "Otro (nuevo)" y escribir su nombre o iniciales en el campo que aparece debajo; quedará disponible en la lista para la próxima vez.</w:t>
       </w:r>
     </w:p>
     <w:p>
       <w:pPr>
-        <w:pStyle w:val="ListNumber"/>
+        <w:ind w:left="357" w:hanging="357"/>
       </w:pPr>
       <w:r>
-        <w:t>Verificar o ajustar la "Fecha".</w:t>
+        <w:rPr>
+          <w:b w:val="0"/>
+        </w:rPr>
+        <w:t>7. Opcional: si el egreso está asociado a una Resolución de Aprobación de Muestra, indicar su folio en "RAM asociado".</w:t>
       </w:r>
     </w:p>
     <w:p>
       <w:pPr>
-        <w:pStyle w:val="ListNumber"/>
+        <w:ind w:left="357" w:hanging="357"/>
       </w:pPr>
       <w:r>
-        <w:t>Opcional: agregar una observación.</w:t>
+        <w:rPr>
+          <w:b w:val="0"/>
+        </w:rPr>
+        <w:t>8. Verificar o ajustar la "Fecha".</w:t>
       </w:r>
     </w:p>
     <w:p>
       <w:pPr>
-        <w:pStyle w:val="ListNumber"/>
+        <w:ind w:left="357" w:hanging="357"/>
       </w:pPr>
       <w:r>
-        <w:t>Presionar "Registrar egreso". El sistema resta la cantidad del stock actual del insumo y deja el movimiento registrado en la tabla "Últimos egresos registrados".</w:t>
+        <w:rPr>
+          <w:b w:val="0"/>
+        </w:rPr>
+        <w:t>9. Opcional: agregar una observación.</w:t>
+      </w:r>
+    </w:p>
+    <w:p>
+      <w:pPr>
+        <w:ind w:left="357" w:hanging="357"/>
+      </w:pPr>
+      <w:r>
+        <w:rPr>
+          <w:b w:val="0"/>
+        </w:rPr>
+        <w:t>10. Presionar "Registrar egreso". El sistema resta la cantidad del stock actual del insumo y deja el movimiento registrado en la tabla "Últimos egresos registrados".</w:t>
       </w:r>
     </w:p>
     <w:p>
@@ -810,39 +1007,51 @@
     </w:p>
     <w:p>
       <w:r>
-        <w:t>Permite visualizar el catálogo completo y su nivel de stock. Pasos:</w:t>
+        <w:rPr>
+          <w:b w:val="0"/>
+        </w:rPr>
+        <w:t>Permite visualizar el catálogo completo, su clasificación, ubicación, stock y alertas vigentes. Pasos:</w:t>
       </w:r>
     </w:p>
     <w:p>
       <w:pPr>
-        <w:pStyle w:val="ListNumber"/>
+        <w:ind w:left="357" w:hanging="357"/>
       </w:pPr>
       <w:r>
-        <w:t>En el menú lateral, seleccionar "Ver Estado".</w:t>
+        <w:rPr>
+          <w:b w:val="0"/>
+        </w:rPr>
+        <w:t>1. En el menú lateral, seleccionar "Ver Estado".</w:t>
       </w:r>
     </w:p>
     <w:p>
       <w:pPr>
-        <w:pStyle w:val="ListNumber"/>
+        <w:ind w:left="357" w:hanging="357"/>
       </w:pPr>
       <w:r>
-        <w:t>La tabla muestra todos los insumos ordenados por clase ABC (A primero), con una columna de alerta visual: 🔴 stock bajo el mínimo, 🟠 stock dentro de un 20% sobre el mínimo, 🟢 stock saludable.</w:t>
+        <w:rPr>
+          <w:b w:val="0"/>
+        </w:rPr>
+        <w:t>2. La tabla muestra todos los insumos ordenados por clase ABC (A primero), con dos alertas independientes: alerta de nivel de stock ("REPONER AHORA" cuando el stock actual es menor o igual al stock mínimo; "OK" en caso contrario) y alerta de ventana de compra ("FUERA DE VENTANA" cuando el stock proyecta caer al mínimo después del día 20 del mes, fuera de la ventana de facturación SDT-USACH; "DENTRO DE VENTANA" en caso contrario).</w:t>
       </w:r>
     </w:p>
     <w:p>
       <w:pPr>
-        <w:pStyle w:val="ListNumber"/>
+        <w:ind w:left="357" w:hanging="357"/>
       </w:pPr>
       <w:r>
-        <w:t>Se pueden editar directamente en la tabla los campos: código, categoría, stock mínimo, unidad, proveedor y los cuatro criterios de clasificación ABC (costo unitario, frecuencia de uso, impacto operacional, tiempo de reposición).</w:t>
+        <w:rPr>
+          <w:b w:val="0"/>
+        </w:rPr>
+        <w:t>3. Se pueden editar directamente en la tabla los campos: código, categoría, operación, unidad, ubicación, proveedor, costo unitario, número de unidades por cambio de set, frecuencia de uso mensual, rendimiento (probetas por cambio), impacto operacional, tiempo de reposición y fuente del dato.</w:t>
       </w:r>
     </w:p>
     <w:p>
-      <w:pPr>
-        <w:pStyle w:val="ListNumber"/>
-      </w:pPr>
       <w:r>
-        <w:t>Al presionar "💾 Guardar cambios", el sistema guarda las modificaciones y recalcula automáticamente la clasificación ABC de todo el catálogo.</w:t>
+        <w:rPr>
+          <w:b w:val="0"/>
+        </w:rPr>
+        <w:t>El stock mínimo y la clasificación ABC no se editan directamente: al presionar "Guardar cambios", el sistema los recalcula automáticamente para todo el catálogo a partir de los campos anteriores, junto con ambas alertas.</w:t>
       </w:r>
     </w:p>
     <w:p>
@@ -855,31 +1064,43 @@
     </w:p>
     <w:p>
       <w:r>
+        <w:rPr>
+          <w:b w:val="0"/>
+        </w:rPr>
         <w:t>Cada insumo del catálogo tiene asignado un código único (formato INS0000). Pasos para su uso:</w:t>
       </w:r>
     </w:p>
     <w:p>
       <w:pPr>
-        <w:pStyle w:val="ListNumber"/>
+        <w:ind w:left="357" w:hanging="357"/>
       </w:pPr>
       <w:r>
-        <w:t>Si un insumo no tiene código asignado, en "Ver Estado" presionar el botón "🏷️ Generar códigos automáticos para insumos sin código".</w:t>
+        <w:rPr>
+          <w:b w:val="0"/>
+        </w:rPr>
+        <w:t>1. Si un insumo no tiene código asignado, en "Ver Estado" presionar el botón "Generar códigos automáticos para insumos sin código".</w:t>
       </w:r>
     </w:p>
     <w:p>
       <w:pPr>
-        <w:pStyle w:val="ListNumber"/>
+        <w:ind w:left="357" w:hanging="357"/>
       </w:pPr>
       <w:r>
-        <w:t>En la sección "🏷️ Etiquetas para imprimir" de "Ver Estado", presionar "Descargar etiquetas (PDF)" para obtener un documento con una etiqueta de código de barras por insumo, lista para imprimir y pegar en cada envase o contenedor.</w:t>
+        <w:rPr>
+          <w:b w:val="0"/>
+        </w:rPr>
+        <w:t>2. En la sección "Etiquetas para imprimir" de "Ver Estado", presionar "Descargar etiquetas (PDF)" para obtener un documento con una etiqueta de código de barras por insumo, lista para imprimir y pegar en cada envase o contenedor.</w:t>
       </w:r>
     </w:p>
     <w:p>
       <w:pPr>
-        <w:pStyle w:val="ListNumber"/>
+        <w:ind w:left="357" w:hanging="357"/>
       </w:pPr>
       <w:r>
-        <w:t>En las pantallas "Registrar Ingreso" y "Registrar Egreso", hacer clic en el campo "Escanear código de barras" y pasar el lector sobre la etiqueta; el sistema selecciona automáticamente el insumo correspondiente.</w:t>
+        <w:rPr>
+          <w:b w:val="0"/>
+        </w:rPr>
+        <w:t>3. En las pantallas "Registrar Ingreso" y "Registrar Egreso", hacer clic en el campo "Escanear código de barras" y pasar el lector sobre la etiqueta; el sistema selecciona automáticamente el insumo correspondiente.</w:t>
       </w:r>
     </w:p>
     <w:p>
@@ -892,47 +1113,76 @@
     </w:p>
     <w:p>
       <w:r>
+        <w:rPr>
+          <w:b w:val="0"/>
+        </w:rPr>
         <w:t>Esta función está restringida al administrador del sistema (SCM) mediante contraseña, para mantener la integridad del catálogo. Pasos:</w:t>
       </w:r>
     </w:p>
     <w:p>
       <w:pPr>
-        <w:pStyle w:val="ListNumber"/>
+        <w:ind w:left="357" w:hanging="357"/>
       </w:pPr>
       <w:r>
-        <w:t>En "Ver Estado", abrir el panel "➕ Agregar nuevo insumo (solo SCM)".</w:t>
+        <w:rPr>
+          <w:b w:val="0"/>
+        </w:rPr>
+        <w:t>1. En "Ver Estado", abrir el panel "Agregar nuevo insumo (solo SCM)".</w:t>
       </w:r>
     </w:p>
     <w:p>
       <w:pPr>
-        <w:pStyle w:val="ListNumber"/>
+        <w:ind w:left="357" w:hanging="357"/>
       </w:pPr>
       <w:r>
-        <w:t>Ingresar la contraseña de administrador y presionar "Desbloquear".</w:t>
+        <w:rPr>
+          <w:b w:val="0"/>
+        </w:rPr>
+        <w:t>2. Ingresar la contraseña de administrador y presionar "Desbloquear".</w:t>
       </w:r>
     </w:p>
     <w:p>
       <w:pPr>
-        <w:pStyle w:val="ListNumber"/>
+        <w:ind w:left="357" w:hanging="357"/>
       </w:pPr>
       <w:r>
-        <w:t>Completar el nombre del insumo (obligatorio), categoría, unidad, stock inicial, stock mínimo y proveedor.</w:t>
+        <w:rPr>
+          <w:b w:val="0"/>
+        </w:rPr>
+        <w:t>3. Completar el nombre del insumo (obligatorio), categoría, operación asociada, ubicación, unidad, proveedor, costo unitario, número de unidades por cambio de set, frecuencia de uso mensual, rendimiento (probetas por cambio) y fuente del dato.</w:t>
       </w:r>
     </w:p>
     <w:p>
       <w:pPr>
-        <w:pStyle w:val="ListNumber"/>
+        <w:ind w:left="357" w:hanging="357"/>
       </w:pPr>
       <w:r>
-        <w:t>Opcional: marcar "Definir criterios de clasificación ABC ahora" e ingresar costo unitario, frecuencia de uso, impacto operacional y tiempo de reposición.</w:t>
+        <w:rPr>
+          <w:b w:val="0"/>
+        </w:rPr>
+        <w:t>4. Opcional: indicar un stock inicial (se registra como un ingreso de apertura).</w:t>
       </w:r>
     </w:p>
     <w:p>
       <w:pPr>
-        <w:pStyle w:val="ListNumber"/>
+        <w:ind w:left="357" w:hanging="357"/>
       </w:pPr>
       <w:r>
-        <w:t>Presionar "Agregar insumo". El sistema asigna un código único automáticamente y recalcula la clasificación ABC de todo el catálogo.</w:t>
+        <w:rPr>
+          <w:b w:val="0"/>
+        </w:rPr>
+        <w:t>5. Opcional: marcar "Definir criterios de clasificación ABC ahora" e ingresar el impacto operacional, para que el insumo quede clasificado de inmediato (junto con costo, frecuencia y tiempo de reposición ya ingresados).</w:t>
+      </w:r>
+    </w:p>
+    <w:p>
+      <w:pPr>
+        <w:ind w:left="357" w:hanging="357"/>
+      </w:pPr>
+      <w:r>
+        <w:rPr>
+          <w:b w:val="0"/>
+        </w:rPr>
+        <w:t>6. Presionar "Agregar insumo". El sistema asigna un código único automáticamente y recalcula la clasificación ABC y el stock mínimo de todo el catálogo.</w:t>
       </w:r>
     </w:p>
     <w:p>
@@ -945,7 +1195,10 @@
     </w:p>
     <w:p>
       <w:r>
-        <w:t>En "Ver Estado", en la sección "⬇ Exportar", presionar el botón "Exportar a Excel" para descargar el estado completo del catálogo (stock, clasificación ABC, proveedor, etc.) en un archivo .xlsx, con el mismo formato de columnas utilizado en la planilla original de clasificación ABC de la tesis.</w:t>
+        <w:rPr>
+          <w:b w:val="0"/>
+        </w:rPr>
+        <w:t>En "Ver Estado", en la sección "Exportar", presionar el botón "Exportar a Excel" para descargar el estado completo del catálogo (clasificación ABC, stock, alertas, ubicación, proveedor, etc.) en un archivo .xlsx.</w:t>
       </w:r>
     </w:p>
     <w:p>
@@ -1008,6 +1261,9 @@
           </w:tcPr>
           <w:p>
             <w:r>
+              <w:rPr>
+                <w:b/>
+              </w:rPr>
               <w:t>Bitácora de ingresos y egresos</w:t>
             </w:r>
           </w:p>
@@ -1018,6 +1274,9 @@
           </w:tcPr>
           <w:p>
             <w:r>
+              <w:rPr>
+                <w:b w:val="0"/>
+              </w:rPr>
               <w:t>Tabla "movimientos" de la base de datos; visible en las tablas "Últimos ingresos/egresos registrados" de cada pantalla.</w:t>
             </w:r>
           </w:p>
@@ -1030,7 +1289,10 @@
           </w:tcPr>
           <w:p>
             <w:r>
-              <w:t>Catálogo de insumos y su clasificación ABC</w:t>
+              <w:rPr>
+                <w:b/>
+              </w:rPr>
+              <w:t>Catálogo de insumos, clasificación ABC, stock mínimo y alertas</w:t>
             </w:r>
           </w:p>
         </w:tc>
@@ -1040,6 +1302,9 @@
           </w:tcPr>
           <w:p>
             <w:r>
+              <w:rPr>
+                <w:b w:val="0"/>
+              </w:rPr>
               <w:t>Tabla "insumos" de la base de datos; visible y editable en "Ver Estado".</w:t>
             </w:r>
           </w:p>
@@ -1052,6 +1317,9 @@
           </w:tcPr>
           <w:p>
             <w:r>
+              <w:rPr>
+                <w:b/>
+              </w:rPr>
               <w:t>Exportación en Excel</w:t>
             </w:r>
           </w:p>
@@ -1062,6 +1330,9 @@
           </w:tcPr>
           <w:p>
             <w:r>
+              <w:rPr>
+                <w:b w:val="0"/>
+              </w:rPr>
               <w:t>Botón "Exportar a Excel" en "Ver Estado".</w:t>
             </w:r>
           </w:p>
@@ -1074,6 +1345,9 @@
           </w:tcPr>
           <w:p>
             <w:r>
+              <w:rPr>
+                <w:b/>
+              </w:rPr>
               <w:t>Etiquetas de código de barras</w:t>
             </w:r>
           </w:p>
@@ -1084,6 +1358,9 @@
           </w:tcPr>
           <w:p>
             <w:r>
+              <w:rPr>
+                <w:b w:val="0"/>
+              </w:rPr>
               <w:t>Botón "Descargar etiquetas (PDF)" en "Ver Estado".</w:t>
             </w:r>
           </w:p>
@@ -1182,6 +1459,9 @@
           </w:tcPr>
           <w:p>
             <w:r>
+              <w:rPr>
+                <w:b w:val="0"/>
+              </w:rPr>
               <w:t>1.0</w:t>
             </w:r>
           </w:p>
@@ -1192,6 +1472,9 @@
           </w:tcPr>
           <w:p>
             <w:r>
+              <w:rPr>
+                <w:b w:val="0"/>
+              </w:rPr>
               <w:t>22-08-2026</w:t>
             </w:r>
           </w:p>
@@ -1202,6 +1485,9 @@
           </w:tcPr>
           <w:p>
             <w:r>
+              <w:rPr>
+                <w:b w:val="0"/>
+              </w:rPr>
               <w:t>Emisión inicial del procedimiento.</w:t>
             </w:r>
           </w:p>
@@ -1212,6 +1498,63 @@
           </w:tcPr>
           <w:p>
             <w:r>
+              <w:rPr>
+                <w:b w:val="0"/>
+              </w:rPr>
+              <w:t>Sofía Cáceres Manzano</w:t>
+            </w:r>
+          </w:p>
+        </w:tc>
+      </w:tr>
+      <w:tr>
+        <w:tc>
+          <w:tcPr>
+            <w:tcW w:type="dxa" w:w="1417"/>
+          </w:tcPr>
+          <w:p>
+            <w:r>
+              <w:rPr>
+                <w:b w:val="0"/>
+              </w:rPr>
+              <w:t>1.1</w:t>
+            </w:r>
+          </w:p>
+        </w:tc>
+        <w:tc>
+          <w:tcPr>
+            <w:tcW w:type="dxa" w:w="1701"/>
+          </w:tcPr>
+          <w:p>
+            <w:r>
+              <w:rPr>
+                <w:b w:val="0"/>
+              </w:rPr>
+              <w:t>31-08-2026</w:t>
+            </w:r>
+          </w:p>
+        </w:tc>
+        <w:tc>
+          <w:tcPr>
+            <w:tcW w:type="dxa" w:w="3402"/>
+          </w:tcPr>
+          <w:p>
+            <w:r>
+              <w:rPr>
+                <w:b w:val="0"/>
+              </w:rPr>
+              <w:t>Se actualiza para reflejar el modelo del Capítulo 4: clasificación ABC con pesos AHP y corte por percentil de ranking; stock mínimo calculado automáticamente (factor de seguridad por clase, redondeo al tamaño del set); nueva alerta de ventana de compra (SDT-USACH); campos de ubicación, operación y RAM asociado.</w:t>
+            </w:r>
+          </w:p>
+        </w:tc>
+        <w:tc>
+          <w:tcPr>
+            <w:tcW w:type="dxa" w:w="2551"/>
+          </w:tcPr>
+          <w:p>
+            <w:r>
+              <w:rPr>
+                <w:b w:val="0"/>
+              </w:rPr>
               <w:t>Sofía Cáceres Manzano</w:t>
             </w:r>
           </w:p>

</xml_diff>